<commit_message>
Expand religion practice with new study material
</commit_message>
<xml_diff>
--- a/deliverables/Loesungen_Pruefung_1_DE.docx
+++ b/deliverables/Loesungen_Pruefung_1_DE.docx
@@ -5528,7 +5528,1766 @@
         <w:pStyle w:val="Heading1"/>
       </w:pPr>
       <w:r>
-        <w:t>11. Schnellkontrolle für Eltern</w:t>
+        <w:t>11. Neue Karteikartenfragen</w:t>
+      </w:r>
+    </w:p>
+    <w:p>
+      <w:pPr>
+        <w:pStyle w:val="Heading2"/>
+      </w:pPr>
+      <w:r>
+        <w:t>Christentum K8 bis K15</w:t>
+      </w:r>
+    </w:p>
+    <w:tbl>
+      <w:tblPr>
+        <w:tblStyle w:val="TableGrid"/>
+        <w:tblW w:type="auto" w:w="0"/>
+        <w:jc w:val="center"/>
+        <w:tblLayout w:type="fixed"/>
+        <w:tblLook w:firstColumn="1" w:firstRow="1" w:lastColumn="0" w:lastRow="0" w:noHBand="0" w:noVBand="1" w:val="04A0"/>
+      </w:tblPr>
+      <w:tblGrid>
+        <w:gridCol w:w="3312"/>
+        <w:gridCol w:w="6048"/>
+      </w:tblGrid>
+      <w:tr>
+        <w:trPr>
+          <w:tblHeader w:val="true"/>
+        </w:trPr>
+        <w:tc>
+          <w:tcPr>
+            <w:tcW w:type="dxa" w:w="4961"/>
+            <w:shd w:fill="E8EEF5"/>
+            <w:tcMar>
+              <w:top w:w="80" w:type="dxa"/>
+              <w:bottom w:w="80" w:type="dxa"/>
+              <w:start w:w="120" w:type="dxa"/>
+              <w:end w:w="120" w:type="dxa"/>
+            </w:tcMar>
+          </w:tcPr>
+          <w:p>
+            <w:r>
+              <w:rPr>
+                <w:b/>
+                <w:color w:val="0B4F4A"/>
+                <w:sz w:val="18"/>
+              </w:rPr>
+              <w:t>Frage</w:t>
+            </w:r>
+          </w:p>
+        </w:tc>
+        <w:tc>
+          <w:tcPr>
+            <w:tcW w:type="dxa" w:w="4961"/>
+            <w:shd w:fill="E8EEF5"/>
+            <w:tcMar>
+              <w:top w:w="80" w:type="dxa"/>
+              <w:bottom w:w="80" w:type="dxa"/>
+              <w:start w:w="120" w:type="dxa"/>
+              <w:end w:w="120" w:type="dxa"/>
+            </w:tcMar>
+          </w:tcPr>
+          <w:p>
+            <w:r>
+              <w:rPr>
+                <w:b/>
+                <w:color w:val="0B4F4A"/>
+                <w:sz w:val="18"/>
+              </w:rPr>
+              <w:t>Präzise Lernantwort</w:t>
+            </w:r>
+          </w:p>
+        </w:tc>
+      </w:tr>
+      <w:tr>
+        <w:tc>
+          <w:tcPr>
+            <w:tcW w:type="dxa" w:w="3312"/>
+            <w:tcMar>
+              <w:top w:w="80" w:type="dxa"/>
+              <w:bottom w:w="80" w:type="dxa"/>
+              <w:start w:w="120" w:type="dxa"/>
+              <w:end w:w="120" w:type="dxa"/>
+            </w:tcMar>
+          </w:tcPr>
+          <w:p>
+            <w:pPr>
+              <w:spacing w:after="40" w:line="264" w:lineRule="auto"/>
+            </w:pPr>
+            <w:r>
+              <w:rPr>
+                <w:sz w:val="18"/>
+              </w:rPr>
+              <w:t>Warum ist der Sonntag heilig?</w:t>
+            </w:r>
+          </w:p>
+        </w:tc>
+        <w:tc>
+          <w:tcPr>
+            <w:tcW w:type="dxa" w:w="6048"/>
+            <w:tcMar>
+              <w:top w:w="80" w:type="dxa"/>
+              <w:bottom w:w="80" w:type="dxa"/>
+              <w:start w:w="120" w:type="dxa"/>
+              <w:end w:w="120" w:type="dxa"/>
+            </w:tcMar>
+          </w:tcPr>
+          <w:p>
+            <w:pPr>
+              <w:spacing w:after="40" w:line="264" w:lineRule="auto"/>
+            </w:pPr>
+            <w:r>
+              <w:rPr>
+                <w:sz w:val="18"/>
+              </w:rPr>
+              <w:t>Er erinnert an die Auferstehung Jesu; Christinnen und Christen feiern Gottesdienst.</w:t>
+            </w:r>
+          </w:p>
+        </w:tc>
+      </w:tr>
+      <w:tr>
+        <w:tc>
+          <w:tcPr>
+            <w:tcW w:type="dxa" w:w="3312"/>
+            <w:tcMar>
+              <w:top w:w="80" w:type="dxa"/>
+              <w:bottom w:w="80" w:type="dxa"/>
+              <w:start w:w="120" w:type="dxa"/>
+              <w:end w:w="120" w:type="dxa"/>
+            </w:tcMar>
+          </w:tcPr>
+          <w:p>
+            <w:pPr>
+              <w:spacing w:after="40" w:line="264" w:lineRule="auto"/>
+            </w:pPr>
+            <w:r>
+              <w:rPr>
+                <w:sz w:val="18"/>
+              </w:rPr>
+              <w:t>Drei Personen der Dreifaltigkeit</w:t>
+            </w:r>
+          </w:p>
+        </w:tc>
+        <w:tc>
+          <w:tcPr>
+            <w:tcW w:type="dxa" w:w="6048"/>
+            <w:tcMar>
+              <w:top w:w="80" w:type="dxa"/>
+              <w:bottom w:w="80" w:type="dxa"/>
+              <w:start w:w="120" w:type="dxa"/>
+              <w:end w:w="120" w:type="dxa"/>
+            </w:tcMar>
+          </w:tcPr>
+          <w:p>
+            <w:pPr>
+              <w:spacing w:after="40" w:line="264" w:lineRule="auto"/>
+            </w:pPr>
+            <w:r>
+              <w:rPr>
+                <w:sz w:val="18"/>
+              </w:rPr>
+              <w:t>Vater, Sohn und Heiliger Geist.</w:t>
+            </w:r>
+          </w:p>
+        </w:tc>
+      </w:tr>
+      <w:tr>
+        <w:tc>
+          <w:tcPr>
+            <w:tcW w:type="dxa" w:w="3312"/>
+            <w:tcMar>
+              <w:top w:w="80" w:type="dxa"/>
+              <w:bottom w:w="80" w:type="dxa"/>
+              <w:start w:w="120" w:type="dxa"/>
+              <w:end w:w="120" w:type="dxa"/>
+            </w:tcMar>
+          </w:tcPr>
+          <w:p>
+            <w:pPr>
+              <w:spacing w:after="40" w:line="264" w:lineRule="auto"/>
+            </w:pPr>
+            <w:r>
+              <w:rPr>
+                <w:sz w:val="18"/>
+              </w:rPr>
+              <w:t>Grosse Glaubensrichtungen</w:t>
+            </w:r>
+          </w:p>
+        </w:tc>
+        <w:tc>
+          <w:tcPr>
+            <w:tcW w:type="dxa" w:w="6048"/>
+            <w:tcMar>
+              <w:top w:w="80" w:type="dxa"/>
+              <w:bottom w:w="80" w:type="dxa"/>
+              <w:start w:w="120" w:type="dxa"/>
+              <w:end w:w="120" w:type="dxa"/>
+            </w:tcMar>
+          </w:tcPr>
+          <w:p>
+            <w:pPr>
+              <w:spacing w:after="40" w:line="264" w:lineRule="auto"/>
+            </w:pPr>
+            <w:r>
+              <w:rPr>
+                <w:sz w:val="18"/>
+              </w:rPr>
+              <w:t>Drei: römisch-katholisch, evangelisch/reformiert und orthodox.</w:t>
+            </w:r>
+          </w:p>
+        </w:tc>
+      </w:tr>
+      <w:tr>
+        <w:tc>
+          <w:tcPr>
+            <w:tcW w:type="dxa" w:w="3312"/>
+            <w:tcMar>
+              <w:top w:w="80" w:type="dxa"/>
+              <w:bottom w:w="80" w:type="dxa"/>
+              <w:start w:w="120" w:type="dxa"/>
+              <w:end w:w="120" w:type="dxa"/>
+            </w:tcMar>
+          </w:tcPr>
+          <w:p>
+            <w:pPr>
+              <w:spacing w:after="40" w:line="264" w:lineRule="auto"/>
+            </w:pPr>
+            <w:r>
+              <w:rPr>
+                <w:sz w:val="18"/>
+              </w:rPr>
+              <w:t>Katholisches Oberhaupt</w:t>
+            </w:r>
+          </w:p>
+        </w:tc>
+        <w:tc>
+          <w:tcPr>
+            <w:tcW w:type="dxa" w:w="6048"/>
+            <w:tcMar>
+              <w:top w:w="80" w:type="dxa"/>
+              <w:bottom w:w="80" w:type="dxa"/>
+              <w:start w:w="120" w:type="dxa"/>
+              <w:end w:w="120" w:type="dxa"/>
+            </w:tcMar>
+          </w:tcPr>
+          <w:p>
+            <w:pPr>
+              <w:spacing w:after="40" w:line="264" w:lineRule="auto"/>
+            </w:pPr>
+            <w:r>
+              <w:rPr>
+                <w:sz w:val="18"/>
+              </w:rPr>
+              <w:t>Der Papst.</w:t>
+            </w:r>
+          </w:p>
+        </w:tc>
+      </w:tr>
+      <w:tr>
+        <w:tc>
+          <w:tcPr>
+            <w:tcW w:type="dxa" w:w="3312"/>
+            <w:tcMar>
+              <w:top w:w="80" w:type="dxa"/>
+              <w:bottom w:w="80" w:type="dxa"/>
+              <w:start w:w="120" w:type="dxa"/>
+              <w:end w:w="120" w:type="dxa"/>
+            </w:tcMar>
+          </w:tcPr>
+          <w:p>
+            <w:pPr>
+              <w:spacing w:after="40" w:line="264" w:lineRule="auto"/>
+            </w:pPr>
+            <w:r>
+              <w:rPr>
+                <w:sz w:val="18"/>
+              </w:rPr>
+              <w:t>Reformation</w:t>
+            </w:r>
+          </w:p>
+        </w:tc>
+        <w:tc>
+          <w:tcPr>
+            <w:tcW w:type="dxa" w:w="6048"/>
+            <w:tcMar>
+              <w:top w:w="80" w:type="dxa"/>
+              <w:bottom w:w="80" w:type="dxa"/>
+              <w:start w:w="120" w:type="dxa"/>
+              <w:end w:w="120" w:type="dxa"/>
+            </w:tcMar>
+          </w:tcPr>
+          <w:p>
+            <w:pPr>
+              <w:spacing w:after="40" w:line="264" w:lineRule="auto"/>
+            </w:pPr>
+            <w:r>
+              <w:rPr>
+                <w:sz w:val="18"/>
+              </w:rPr>
+              <w:t>Für das Arbeitsblatt: Martin Luther. Historisch gab es mehrere Reformatoren.</w:t>
+            </w:r>
+          </w:p>
+        </w:tc>
+      </w:tr>
+      <w:tr>
+        <w:tc>
+          <w:tcPr>
+            <w:tcW w:type="dxa" w:w="3312"/>
+            <w:tcMar>
+              <w:top w:w="80" w:type="dxa"/>
+              <w:bottom w:w="80" w:type="dxa"/>
+              <w:start w:w="120" w:type="dxa"/>
+              <w:end w:w="120" w:type="dxa"/>
+            </w:tcMar>
+          </w:tcPr>
+          <w:p>
+            <w:pPr>
+              <w:spacing w:after="40" w:line="264" w:lineRule="auto"/>
+            </w:pPr>
+            <w:r>
+              <w:rPr>
+                <w:sz w:val="18"/>
+              </w:rPr>
+              <w:t>Orthodoxe Heiligenbilder</w:t>
+            </w:r>
+          </w:p>
+        </w:tc>
+        <w:tc>
+          <w:tcPr>
+            <w:tcW w:type="dxa" w:w="6048"/>
+            <w:tcMar>
+              <w:top w:w="80" w:type="dxa"/>
+              <w:bottom w:w="80" w:type="dxa"/>
+              <w:start w:w="120" w:type="dxa"/>
+              <w:end w:w="120" w:type="dxa"/>
+            </w:tcMar>
+          </w:tcPr>
+          <w:p>
+            <w:pPr>
+              <w:spacing w:after="40" w:line="264" w:lineRule="auto"/>
+            </w:pPr>
+            <w:r>
+              <w:rPr>
+                <w:sz w:val="18"/>
+              </w:rPr>
+              <w:t>Ikonen.</w:t>
+            </w:r>
+          </w:p>
+        </w:tc>
+      </w:tr>
+      <w:tr>
+        <w:tc>
+          <w:tcPr>
+            <w:tcW w:type="dxa" w:w="3312"/>
+            <w:tcMar>
+              <w:top w:w="80" w:type="dxa"/>
+              <w:bottom w:w="80" w:type="dxa"/>
+              <w:start w:w="120" w:type="dxa"/>
+              <w:end w:w="120" w:type="dxa"/>
+            </w:tcMar>
+          </w:tcPr>
+          <w:p>
+            <w:pPr>
+              <w:spacing w:after="40" w:line="264" w:lineRule="auto"/>
+            </w:pPr>
+            <w:r>
+              <w:rPr>
+                <w:sz w:val="18"/>
+              </w:rPr>
+              <w:t>Beispiel für eine Freikirche</w:t>
+            </w:r>
+          </w:p>
+        </w:tc>
+        <w:tc>
+          <w:tcPr>
+            <w:tcW w:type="dxa" w:w="6048"/>
+            <w:tcMar>
+              <w:top w:w="80" w:type="dxa"/>
+              <w:bottom w:w="80" w:type="dxa"/>
+              <w:start w:w="120" w:type="dxa"/>
+              <w:end w:w="120" w:type="dxa"/>
+            </w:tcMar>
+          </w:tcPr>
+          <w:p>
+            <w:pPr>
+              <w:spacing w:after="40" w:line="264" w:lineRule="auto"/>
+            </w:pPr>
+            <w:r>
+              <w:rPr>
+                <w:sz w:val="18"/>
+              </w:rPr>
+              <w:t>Zum Beispiel Baptisten, Methodisten, Mennoniten oder Pfingstgemeinden.</w:t>
+            </w:r>
+          </w:p>
+        </w:tc>
+      </w:tr>
+      <w:tr>
+        <w:tc>
+          <w:tcPr>
+            <w:tcW w:type="dxa" w:w="3312"/>
+            <w:tcMar>
+              <w:top w:w="80" w:type="dxa"/>
+              <w:bottom w:w="80" w:type="dxa"/>
+              <w:start w:w="120" w:type="dxa"/>
+              <w:end w:w="120" w:type="dxa"/>
+            </w:tcMar>
+          </w:tcPr>
+          <w:p>
+            <w:pPr>
+              <w:spacing w:after="40" w:line="264" w:lineRule="auto"/>
+            </w:pPr>
+            <w:r>
+              <w:rPr>
+                <w:sz w:val="18"/>
+              </w:rPr>
+              <w:t>Hoffnung bei einer Pilgerreise</w:t>
+            </w:r>
+          </w:p>
+        </w:tc>
+        <w:tc>
+          <w:tcPr>
+            <w:tcW w:type="dxa" w:w="6048"/>
+            <w:tcMar>
+              <w:top w:w="80" w:type="dxa"/>
+              <w:bottom w:w="80" w:type="dxa"/>
+              <w:start w:w="120" w:type="dxa"/>
+              <w:end w:w="120" w:type="dxa"/>
+            </w:tcMar>
+          </w:tcPr>
+          <w:p>
+            <w:pPr>
+              <w:spacing w:after="40" w:line="264" w:lineRule="auto"/>
+            </w:pPr>
+            <w:r>
+              <w:rPr>
+                <w:sz w:val="18"/>
+              </w:rPr>
+              <w:t>Den Glauben vertiefen, beten, sich auf Gott besinnen und Gemeinschaft erleben.</w:t>
+            </w:r>
+          </w:p>
+        </w:tc>
+      </w:tr>
+    </w:tbl>
+    <w:p>
+      <w:pPr>
+        <w:spacing w:after="20"/>
+      </w:pPr>
+      <w:r>
+        <w:rPr>
+          <w:b w:val="0"/>
+          <w:i w:val="0"/>
+        </w:rPr>
+      </w:r>
+    </w:p>
+    <w:p>
+      <w:pPr>
+        <w:pStyle w:val="Heading2"/>
+      </w:pPr>
+      <w:r>
+        <w:t>Judentum K1 bis K13</w:t>
+      </w:r>
+    </w:p>
+    <w:tbl>
+      <w:tblPr>
+        <w:tblStyle w:val="TableGrid"/>
+        <w:tblW w:type="auto" w:w="0"/>
+        <w:jc w:val="center"/>
+        <w:tblLayout w:type="fixed"/>
+        <w:tblLook w:firstColumn="1" w:firstRow="1" w:lastColumn="0" w:lastRow="0" w:noHBand="0" w:noVBand="1" w:val="04A0"/>
+      </w:tblPr>
+      <w:tblGrid>
+        <w:gridCol w:w="3312"/>
+        <w:gridCol w:w="6048"/>
+      </w:tblGrid>
+      <w:tr>
+        <w:trPr>
+          <w:tblHeader w:val="true"/>
+        </w:trPr>
+        <w:tc>
+          <w:tcPr>
+            <w:tcW w:type="dxa" w:w="4961"/>
+            <w:shd w:fill="E8EEF5"/>
+            <w:tcMar>
+              <w:top w:w="80" w:type="dxa"/>
+              <w:bottom w:w="80" w:type="dxa"/>
+              <w:start w:w="120" w:type="dxa"/>
+              <w:end w:w="120" w:type="dxa"/>
+            </w:tcMar>
+          </w:tcPr>
+          <w:p>
+            <w:r>
+              <w:rPr>
+                <w:b/>
+                <w:color w:val="0B4F4A"/>
+                <w:sz w:val="17"/>
+              </w:rPr>
+              <w:t>Frage</w:t>
+            </w:r>
+          </w:p>
+        </w:tc>
+        <w:tc>
+          <w:tcPr>
+            <w:tcW w:type="dxa" w:w="4961"/>
+            <w:shd w:fill="E8EEF5"/>
+            <w:tcMar>
+              <w:top w:w="80" w:type="dxa"/>
+              <w:bottom w:w="80" w:type="dxa"/>
+              <w:start w:w="120" w:type="dxa"/>
+              <w:end w:w="120" w:type="dxa"/>
+            </w:tcMar>
+          </w:tcPr>
+          <w:p>
+            <w:r>
+              <w:rPr>
+                <w:b/>
+                <w:color w:val="0B4F4A"/>
+                <w:sz w:val="17"/>
+              </w:rPr>
+              <w:t>Präzise Lernantwort</w:t>
+            </w:r>
+          </w:p>
+        </w:tc>
+      </w:tr>
+      <w:tr>
+        <w:tc>
+          <w:tcPr>
+            <w:tcW w:type="dxa" w:w="3312"/>
+            <w:tcMar>
+              <w:top w:w="80" w:type="dxa"/>
+              <w:bottom w:w="80" w:type="dxa"/>
+              <w:start w:w="120" w:type="dxa"/>
+              <w:end w:w="120" w:type="dxa"/>
+            </w:tcMar>
+          </w:tcPr>
+          <w:p>
+            <w:pPr>
+              <w:spacing w:after="40" w:line="264" w:lineRule="auto"/>
+            </w:pPr>
+            <w:r>
+              <w:rPr>
+                <w:sz w:val="17"/>
+              </w:rPr>
+              <w:t>Alter und Zahl</w:t>
+            </w:r>
+          </w:p>
+        </w:tc>
+        <w:tc>
+          <w:tcPr>
+            <w:tcW w:type="dxa" w:w="6048"/>
+            <w:tcMar>
+              <w:top w:w="80" w:type="dxa"/>
+              <w:bottom w:w="80" w:type="dxa"/>
+              <w:start w:w="120" w:type="dxa"/>
+              <w:end w:w="120" w:type="dxa"/>
+            </w:tcMar>
+          </w:tcPr>
+          <w:p>
+            <w:pPr>
+              <w:spacing w:after="40" w:line="264" w:lineRule="auto"/>
+            </w:pPr>
+            <w:r>
+              <w:rPr>
+                <w:sz w:val="17"/>
+              </w:rPr>
+              <w:t>Für die Karteikarte: rund 4000 Jahre und rund 14 Millionen. Aktuelle Schätzungen liegen höher und hängen von der Definition ab.</w:t>
+            </w:r>
+          </w:p>
+        </w:tc>
+      </w:tr>
+      <w:tr>
+        <w:tc>
+          <w:tcPr>
+            <w:tcW w:type="dxa" w:w="3312"/>
+            <w:tcMar>
+              <w:top w:w="80" w:type="dxa"/>
+              <w:bottom w:w="80" w:type="dxa"/>
+              <w:start w:w="120" w:type="dxa"/>
+              <w:end w:w="120" w:type="dxa"/>
+            </w:tcMar>
+          </w:tcPr>
+          <w:p>
+            <w:pPr>
+              <w:spacing w:after="40" w:line="264" w:lineRule="auto"/>
+            </w:pPr>
+            <w:r>
+              <w:rPr>
+                <w:sz w:val="17"/>
+              </w:rPr>
+              <w:t>Land mit den meisten Juden</w:t>
+            </w:r>
+          </w:p>
+        </w:tc>
+        <w:tc>
+          <w:tcPr>
+            <w:tcW w:type="dxa" w:w="6048"/>
+            <w:tcMar>
+              <w:top w:w="80" w:type="dxa"/>
+              <w:bottom w:w="80" w:type="dxa"/>
+              <w:start w:w="120" w:type="dxa"/>
+              <w:end w:w="120" w:type="dxa"/>
+            </w:tcMar>
+          </w:tcPr>
+          <w:p>
+            <w:pPr>
+              <w:spacing w:after="40" w:line="264" w:lineRule="auto"/>
+            </w:pPr>
+            <w:r>
+              <w:rPr>
+                <w:sz w:val="17"/>
+              </w:rPr>
+              <w:t>Israel; danach folgen die USA.</w:t>
+            </w:r>
+          </w:p>
+        </w:tc>
+      </w:tr>
+      <w:tr>
+        <w:tc>
+          <w:tcPr>
+            <w:tcW w:type="dxa" w:w="3312"/>
+            <w:tcMar>
+              <w:top w:w="80" w:type="dxa"/>
+              <w:bottom w:w="80" w:type="dxa"/>
+              <w:start w:w="120" w:type="dxa"/>
+              <w:end w:w="120" w:type="dxa"/>
+            </w:tcMar>
+          </w:tcPr>
+          <w:p>
+            <w:pPr>
+              <w:spacing w:after="40" w:line="264" w:lineRule="auto"/>
+            </w:pPr>
+            <w:r>
+              <w:rPr>
+                <w:sz w:val="17"/>
+              </w:rPr>
+              <w:t>Bund mit Abraham</w:t>
+            </w:r>
+          </w:p>
+        </w:tc>
+        <w:tc>
+          <w:tcPr>
+            <w:tcW w:type="dxa" w:w="6048"/>
+            <w:tcMar>
+              <w:top w:w="80" w:type="dxa"/>
+              <w:bottom w:w="80" w:type="dxa"/>
+              <w:start w:w="120" w:type="dxa"/>
+              <w:end w:w="120" w:type="dxa"/>
+            </w:tcMar>
+          </w:tcPr>
+          <w:p>
+            <w:pPr>
+              <w:spacing w:after="40" w:line="264" w:lineRule="auto"/>
+            </w:pPr>
+            <w:r>
+              <w:rPr>
+                <w:sz w:val="17"/>
+              </w:rPr>
+              <w:t>Gott schloss nach jüdischer Überlieferung einen Bund mit Abraham und versprach ihm zahlreiche Nachkommen.</w:t>
+            </w:r>
+          </w:p>
+        </w:tc>
+      </w:tr>
+      <w:tr>
+        <w:tc>
+          <w:tcPr>
+            <w:tcW w:type="dxa" w:w="3312"/>
+            <w:tcMar>
+              <w:top w:w="80" w:type="dxa"/>
+              <w:bottom w:w="80" w:type="dxa"/>
+              <w:start w:w="120" w:type="dxa"/>
+              <w:end w:w="120" w:type="dxa"/>
+            </w:tcMar>
+          </w:tcPr>
+          <w:p>
+            <w:pPr>
+              <w:spacing w:after="40" w:line="264" w:lineRule="auto"/>
+            </w:pPr>
+            <w:r>
+              <w:rPr>
+                <w:sz w:val="17"/>
+              </w:rPr>
+              <w:t>Erwarteter Erlöser</w:t>
+            </w:r>
+          </w:p>
+        </w:tc>
+        <w:tc>
+          <w:tcPr>
+            <w:tcW w:type="dxa" w:w="6048"/>
+            <w:tcMar>
+              <w:top w:w="80" w:type="dxa"/>
+              <w:bottom w:w="80" w:type="dxa"/>
+              <w:start w:w="120" w:type="dxa"/>
+              <w:end w:w="120" w:type="dxa"/>
+            </w:tcMar>
+          </w:tcPr>
+          <w:p>
+            <w:pPr>
+              <w:spacing w:after="40" w:line="264" w:lineRule="auto"/>
+            </w:pPr>
+            <w:r>
+              <w:rPr>
+                <w:sz w:val="17"/>
+              </w:rPr>
+              <w:t>Messias.</w:t>
+            </w:r>
+          </w:p>
+        </w:tc>
+      </w:tr>
+      <w:tr>
+        <w:tc>
+          <w:tcPr>
+            <w:tcW w:type="dxa" w:w="3312"/>
+            <w:tcMar>
+              <w:top w:w="80" w:type="dxa"/>
+              <w:bottom w:w="80" w:type="dxa"/>
+              <w:start w:w="120" w:type="dxa"/>
+              <w:end w:w="120" w:type="dxa"/>
+            </w:tcMar>
+          </w:tcPr>
+          <w:p>
+            <w:pPr>
+              <w:spacing w:after="40" w:line="264" w:lineRule="auto"/>
+            </w:pPr>
+            <w:r>
+              <w:rPr>
+                <w:sz w:val="17"/>
+              </w:rPr>
+              <w:t>Symbol</w:t>
+            </w:r>
+          </w:p>
+        </w:tc>
+        <w:tc>
+          <w:tcPr>
+            <w:tcW w:type="dxa" w:w="6048"/>
+            <w:tcMar>
+              <w:top w:w="80" w:type="dxa"/>
+              <w:bottom w:w="80" w:type="dxa"/>
+              <w:start w:w="120" w:type="dxa"/>
+              <w:end w:w="120" w:type="dxa"/>
+            </w:tcMar>
+          </w:tcPr>
+          <w:p>
+            <w:pPr>
+              <w:spacing w:after="40" w:line="264" w:lineRule="auto"/>
+            </w:pPr>
+            <w:r>
+              <w:rPr>
+                <w:sz w:val="17"/>
+              </w:rPr>
+              <w:t>Im Lernpaket: Davidstern. Die Menora ist ebenfalls ein wichtiges jüdisches Symbol.</w:t>
+            </w:r>
+          </w:p>
+        </w:tc>
+      </w:tr>
+      <w:tr>
+        <w:tc>
+          <w:tcPr>
+            <w:tcW w:type="dxa" w:w="3312"/>
+            <w:tcMar>
+              <w:top w:w="80" w:type="dxa"/>
+              <w:bottom w:w="80" w:type="dxa"/>
+              <w:start w:w="120" w:type="dxa"/>
+              <w:end w:w="120" w:type="dxa"/>
+            </w:tcMar>
+          </w:tcPr>
+          <w:p>
+            <w:pPr>
+              <w:spacing w:after="40" w:line="264" w:lineRule="auto"/>
+            </w:pPr>
+            <w:r>
+              <w:rPr>
+                <w:sz w:val="17"/>
+              </w:rPr>
+              <w:t>Heilige Schrift</w:t>
+            </w:r>
+          </w:p>
+        </w:tc>
+        <w:tc>
+          <w:tcPr>
+            <w:tcW w:type="dxa" w:w="6048"/>
+            <w:tcMar>
+              <w:top w:w="80" w:type="dxa"/>
+              <w:bottom w:w="80" w:type="dxa"/>
+              <w:start w:w="120" w:type="dxa"/>
+              <w:end w:w="120" w:type="dxa"/>
+            </w:tcMar>
+          </w:tcPr>
+          <w:p>
+            <w:pPr>
+              <w:spacing w:after="40" w:line="264" w:lineRule="auto"/>
+            </w:pPr>
+            <w:r>
+              <w:rPr>
+                <w:sz w:val="17"/>
+              </w:rPr>
+              <w:t>Tanach; sein erster und zentraler Teil ist die Tora.</w:t>
+            </w:r>
+          </w:p>
+        </w:tc>
+      </w:tr>
+      <w:tr>
+        <w:tc>
+          <w:tcPr>
+            <w:tcW w:type="dxa" w:w="3312"/>
+            <w:tcMar>
+              <w:top w:w="80" w:type="dxa"/>
+              <w:bottom w:w="80" w:type="dxa"/>
+              <w:start w:w="120" w:type="dxa"/>
+              <w:end w:w="120" w:type="dxa"/>
+            </w:tcMar>
+          </w:tcPr>
+          <w:p>
+            <w:pPr>
+              <w:spacing w:after="40" w:line="264" w:lineRule="auto"/>
+            </w:pPr>
+            <w:r>
+              <w:rPr>
+                <w:sz w:val="17"/>
+              </w:rPr>
+              <w:t>Gebetshaus und Ruhetag</w:t>
+            </w:r>
+          </w:p>
+        </w:tc>
+        <w:tc>
+          <w:tcPr>
+            <w:tcW w:type="dxa" w:w="6048"/>
+            <w:tcMar>
+              <w:top w:w="80" w:type="dxa"/>
+              <w:bottom w:w="80" w:type="dxa"/>
+              <w:start w:w="120" w:type="dxa"/>
+              <w:end w:w="120" w:type="dxa"/>
+            </w:tcMar>
+          </w:tcPr>
+          <w:p>
+            <w:pPr>
+              <w:spacing w:after="40" w:line="264" w:lineRule="auto"/>
+            </w:pPr>
+            <w:r>
+              <w:rPr>
+                <w:sz w:val="17"/>
+              </w:rPr>
+              <w:t>Synagoge; Schabbat oder Sabbat.</w:t>
+            </w:r>
+          </w:p>
+        </w:tc>
+      </w:tr>
+      <w:tr>
+        <w:tc>
+          <w:tcPr>
+            <w:tcW w:type="dxa" w:w="3312"/>
+            <w:tcMar>
+              <w:top w:w="80" w:type="dxa"/>
+              <w:bottom w:w="80" w:type="dxa"/>
+              <w:start w:w="120" w:type="dxa"/>
+              <w:end w:w="120" w:type="dxa"/>
+            </w:tcMar>
+          </w:tcPr>
+          <w:p>
+            <w:pPr>
+              <w:spacing w:after="40" w:line="264" w:lineRule="auto"/>
+            </w:pPr>
+            <w:r>
+              <w:rPr>
+                <w:sz w:val="17"/>
+              </w:rPr>
+              <w:t>Kippa, Tallit, Tefillin</w:t>
+            </w:r>
+          </w:p>
+        </w:tc>
+        <w:tc>
+          <w:tcPr>
+            <w:tcW w:type="dxa" w:w="6048"/>
+            <w:tcMar>
+              <w:top w:w="80" w:type="dxa"/>
+              <w:bottom w:w="80" w:type="dxa"/>
+              <w:start w:w="120" w:type="dxa"/>
+              <w:end w:w="120" w:type="dxa"/>
+            </w:tcMar>
+          </w:tcPr>
+          <w:p>
+            <w:pPr>
+              <w:spacing w:after="40" w:line="264" w:lineRule="auto"/>
+            </w:pPr>
+            <w:r>
+              <w:rPr>
+                <w:sz w:val="17"/>
+              </w:rPr>
+              <w:t>Kopfbedeckung; Gebetsschal; Gebetsriemen mit Kapseln und Toratexten.</w:t>
+            </w:r>
+          </w:p>
+        </w:tc>
+      </w:tr>
+      <w:tr>
+        <w:tc>
+          <w:tcPr>
+            <w:tcW w:type="dxa" w:w="3312"/>
+            <w:tcMar>
+              <w:top w:w="80" w:type="dxa"/>
+              <w:bottom w:w="80" w:type="dxa"/>
+              <w:start w:w="120" w:type="dxa"/>
+              <w:end w:w="120" w:type="dxa"/>
+            </w:tcMar>
+          </w:tcPr>
+          <w:p>
+            <w:pPr>
+              <w:spacing w:after="40" w:line="264" w:lineRule="auto"/>
+            </w:pPr>
+            <w:r>
+              <w:rPr>
+                <w:sz w:val="17"/>
+              </w:rPr>
+              <w:t>Nicht zusammen essen</w:t>
+            </w:r>
+          </w:p>
+        </w:tc>
+        <w:tc>
+          <w:tcPr>
+            <w:tcW w:type="dxa" w:w="6048"/>
+            <w:tcMar>
+              <w:top w:w="80" w:type="dxa"/>
+              <w:bottom w:w="80" w:type="dxa"/>
+              <w:start w:w="120" w:type="dxa"/>
+              <w:end w:w="120" w:type="dxa"/>
+            </w:tcMar>
+          </w:tcPr>
+          <w:p>
+            <w:pPr>
+              <w:spacing w:after="40" w:line="264" w:lineRule="auto"/>
+            </w:pPr>
+            <w:r>
+              <w:rPr>
+                <w:sz w:val="17"/>
+              </w:rPr>
+              <w:t>Fleisch und Milchprodukte.</w:t>
+            </w:r>
+          </w:p>
+        </w:tc>
+      </w:tr>
+      <w:tr>
+        <w:tc>
+          <w:tcPr>
+            <w:tcW w:type="dxa" w:w="3312"/>
+            <w:tcMar>
+              <w:top w:w="80" w:type="dxa"/>
+              <w:bottom w:w="80" w:type="dxa"/>
+              <w:start w:w="120" w:type="dxa"/>
+              <w:end w:w="120" w:type="dxa"/>
+            </w:tcMar>
+          </w:tcPr>
+          <w:p>
+            <w:pPr>
+              <w:spacing w:after="40" w:line="264" w:lineRule="auto"/>
+            </w:pPr>
+            <w:r>
+              <w:rPr>
+                <w:sz w:val="17"/>
+              </w:rPr>
+              <w:t>Hülse am Türpfosten</w:t>
+            </w:r>
+          </w:p>
+        </w:tc>
+        <w:tc>
+          <w:tcPr>
+            <w:tcW w:type="dxa" w:w="6048"/>
+            <w:tcMar>
+              <w:top w:w="80" w:type="dxa"/>
+              <w:bottom w:w="80" w:type="dxa"/>
+              <w:start w:w="120" w:type="dxa"/>
+              <w:end w:w="120" w:type="dxa"/>
+            </w:tcMar>
+          </w:tcPr>
+          <w:p>
+            <w:pPr>
+              <w:spacing w:after="40" w:line="264" w:lineRule="auto"/>
+            </w:pPr>
+            <w:r>
+              <w:rPr>
+                <w:sz w:val="17"/>
+              </w:rPr>
+              <w:t>Mesusa; sie enthält einen Pergamenttext.</w:t>
+            </w:r>
+          </w:p>
+        </w:tc>
+      </w:tr>
+      <w:tr>
+        <w:tc>
+          <w:tcPr>
+            <w:tcW w:type="dxa" w:w="3312"/>
+            <w:tcMar>
+              <w:top w:w="80" w:type="dxa"/>
+              <w:bottom w:w="80" w:type="dxa"/>
+              <w:start w:w="120" w:type="dxa"/>
+              <w:end w:w="120" w:type="dxa"/>
+            </w:tcMar>
+          </w:tcPr>
+          <w:p>
+            <w:pPr>
+              <w:spacing w:after="40" w:line="264" w:lineRule="auto"/>
+            </w:pPr>
+            <w:r>
+              <w:rPr>
+                <w:sz w:val="17"/>
+              </w:rPr>
+              <w:t>Heilige Mauer in Jerusalem</w:t>
+            </w:r>
+          </w:p>
+        </w:tc>
+        <w:tc>
+          <w:tcPr>
+            <w:tcW w:type="dxa" w:w="6048"/>
+            <w:tcMar>
+              <w:top w:w="80" w:type="dxa"/>
+              <w:bottom w:w="80" w:type="dxa"/>
+              <w:start w:w="120" w:type="dxa"/>
+              <w:end w:w="120" w:type="dxa"/>
+            </w:tcMar>
+          </w:tcPr>
+          <w:p>
+            <w:pPr>
+              <w:spacing w:after="40" w:line="264" w:lineRule="auto"/>
+            </w:pPr>
+            <w:r>
+              <w:rPr>
+                <w:sz w:val="17"/>
+              </w:rPr>
+              <w:t>Westmauer, auch Klagemauer genannt.</w:t>
+            </w:r>
+          </w:p>
+        </w:tc>
+      </w:tr>
+      <w:tr>
+        <w:tc>
+          <w:tcPr>
+            <w:tcW w:type="dxa" w:w="3312"/>
+            <w:tcMar>
+              <w:top w:w="80" w:type="dxa"/>
+              <w:bottom w:w="80" w:type="dxa"/>
+              <w:start w:w="120" w:type="dxa"/>
+              <w:end w:w="120" w:type="dxa"/>
+            </w:tcMar>
+          </w:tcPr>
+          <w:p>
+            <w:pPr>
+              <w:spacing w:after="40" w:line="264" w:lineRule="auto"/>
+            </w:pPr>
+            <w:r>
+              <w:rPr>
+                <w:sz w:val="17"/>
+              </w:rPr>
+              <w:t>Rabbiner</w:t>
+            </w:r>
+          </w:p>
+        </w:tc>
+        <w:tc>
+          <w:tcPr>
+            <w:tcW w:type="dxa" w:w="6048"/>
+            <w:tcMar>
+              <w:top w:w="80" w:type="dxa"/>
+              <w:bottom w:w="80" w:type="dxa"/>
+              <w:start w:w="120" w:type="dxa"/>
+              <w:end w:w="120" w:type="dxa"/>
+            </w:tcMar>
+          </w:tcPr>
+          <w:p>
+            <w:pPr>
+              <w:spacing w:after="40" w:line="264" w:lineRule="auto"/>
+            </w:pPr>
+            <w:r>
+              <w:rPr>
+                <w:sz w:val="17"/>
+              </w:rPr>
+              <w:t>Lehrer und Ausleger der jüdischen Tradition; keine Priester.</w:t>
+            </w:r>
+          </w:p>
+        </w:tc>
+      </w:tr>
+    </w:tbl>
+    <w:p>
+      <w:pPr>
+        <w:spacing w:after="20"/>
+      </w:pPr>
+      <w:r>
+        <w:rPr>
+          <w:b w:val="0"/>
+          <w:i w:val="0"/>
+        </w:rPr>
+      </w:r>
+    </w:p>
+    <w:p>
+      <w:r>
+        <w:br w:type="page"/>
+      </w:r>
+    </w:p>
+    <w:p>
+      <w:pPr>
+        <w:pStyle w:val="Heading1"/>
+      </w:pPr>
+      <w:r>
+        <w:t>12. Genauigkeitsprüfung der Antworten von David</w:t>
+      </w:r>
+    </w:p>
+    <w:tbl>
+      <w:tblPr>
+        <w:tblStyle w:val="TableGrid"/>
+        <w:tblW w:type="auto" w:w="0"/>
+        <w:jc w:val="center"/>
+        <w:tblLayout w:type="fixed"/>
+        <w:tblLook w:firstColumn="1" w:firstRow="1" w:lastColumn="0" w:lastRow="0" w:noHBand="0" w:noVBand="1" w:val="04A0"/>
+      </w:tblPr>
+      <w:tblGrid>
+        <w:gridCol w:w="2232"/>
+        <w:gridCol w:w="1944"/>
+        <w:gridCol w:w="5184"/>
+      </w:tblGrid>
+      <w:tr>
+        <w:trPr>
+          <w:tblHeader w:val="true"/>
+        </w:trPr>
+        <w:tc>
+          <w:tcPr>
+            <w:tcW w:type="dxa" w:w="3307"/>
+            <w:shd w:fill="E8EEF5"/>
+            <w:tcMar>
+              <w:top w:w="80" w:type="dxa"/>
+              <w:bottom w:w="80" w:type="dxa"/>
+              <w:start w:w="120" w:type="dxa"/>
+              <w:end w:w="120" w:type="dxa"/>
+            </w:tcMar>
+          </w:tcPr>
+          <w:p>
+            <w:r>
+              <w:rPr>
+                <w:b/>
+                <w:color w:val="0B4F4A"/>
+                <w:sz w:val="17"/>
+              </w:rPr>
+              <w:t>Arbeitsblatt</w:t>
+            </w:r>
+          </w:p>
+        </w:tc>
+        <w:tc>
+          <w:tcPr>
+            <w:tcW w:type="dxa" w:w="3307"/>
+            <w:shd w:fill="E8EEF5"/>
+            <w:tcMar>
+              <w:top w:w="80" w:type="dxa"/>
+              <w:bottom w:w="80" w:type="dxa"/>
+              <w:start w:w="120" w:type="dxa"/>
+              <w:end w:w="120" w:type="dxa"/>
+            </w:tcMar>
+          </w:tcPr>
+          <w:p>
+            <w:r>
+              <w:rPr>
+                <w:b/>
+                <w:color w:val="0B4F4A"/>
+                <w:sz w:val="17"/>
+              </w:rPr>
+              <w:t>Beurteilung</w:t>
+            </w:r>
+          </w:p>
+        </w:tc>
+        <w:tc>
+          <w:tcPr>
+            <w:tcW w:type="dxa" w:w="3307"/>
+            <w:shd w:fill="E8EEF5"/>
+            <w:tcMar>
+              <w:top w:w="80" w:type="dxa"/>
+              <w:bottom w:w="80" w:type="dxa"/>
+              <w:start w:w="120" w:type="dxa"/>
+              <w:end w:w="120" w:type="dxa"/>
+            </w:tcMar>
+          </w:tcPr>
+          <w:p>
+            <w:r>
+              <w:rPr>
+                <w:b/>
+                <w:color w:val="0B4F4A"/>
+                <w:sz w:val="17"/>
+              </w:rPr>
+              <w:t>Korrektur oder Präzisierung</w:t>
+            </w:r>
+          </w:p>
+        </w:tc>
+      </w:tr>
+      <w:tr>
+        <w:tc>
+          <w:tcPr>
+            <w:tcW w:type="dxa" w:w="2232"/>
+            <w:tcMar>
+              <w:top w:w="80" w:type="dxa"/>
+              <w:bottom w:w="80" w:type="dxa"/>
+              <w:start w:w="120" w:type="dxa"/>
+              <w:end w:w="120" w:type="dxa"/>
+            </w:tcMar>
+          </w:tcPr>
+          <w:p>
+            <w:pPr>
+              <w:spacing w:after="40" w:line="264" w:lineRule="auto"/>
+            </w:pPr>
+            <w:r>
+              <w:rPr>
+                <w:sz w:val="17"/>
+              </w:rPr>
+              <w:t>Namen Allahs</w:t>
+            </w:r>
+          </w:p>
+        </w:tc>
+        <w:tc>
+          <w:tcPr>
+            <w:tcW w:type="dxa" w:w="1944"/>
+            <w:tcMar>
+              <w:top w:w="80" w:type="dxa"/>
+              <w:bottom w:w="80" w:type="dxa"/>
+              <w:start w:w="120" w:type="dxa"/>
+              <w:end w:w="120" w:type="dxa"/>
+            </w:tcMar>
+          </w:tcPr>
+          <w:p>
+            <w:pPr>
+              <w:spacing w:after="40" w:line="264" w:lineRule="auto"/>
+            </w:pPr>
+            <w:r>
+              <w:rPr>
+                <w:sz w:val="17"/>
+              </w:rPr>
+              <w:t>teilweise richtig</w:t>
+            </w:r>
+          </w:p>
+        </w:tc>
+        <w:tc>
+          <w:tcPr>
+            <w:tcW w:type="dxa" w:w="5184"/>
+            <w:tcMar>
+              <w:top w:w="80" w:type="dxa"/>
+              <w:bottom w:w="80" w:type="dxa"/>
+              <w:start w:w="120" w:type="dxa"/>
+              <w:end w:w="120" w:type="dxa"/>
+            </w:tcMar>
+          </w:tcPr>
+          <w:p>
+            <w:pPr>
+              <w:spacing w:after="40" w:line="264" w:lineRule="auto"/>
+            </w:pPr>
+            <w:r>
+              <w:rPr>
+                <w:sz w:val="17"/>
+              </w:rPr>
+              <w:t>Allah; der Wächter; der Liebende. 'Der Geliebte' hat eine andere Bedeutung.</w:t>
+            </w:r>
+          </w:p>
+        </w:tc>
+      </w:tr>
+      <w:tr>
+        <w:tc>
+          <w:tcPr>
+            <w:tcW w:type="dxa" w:w="2232"/>
+            <w:tcMar>
+              <w:top w:w="80" w:type="dxa"/>
+              <w:bottom w:w="80" w:type="dxa"/>
+              <w:start w:w="120" w:type="dxa"/>
+              <w:end w:w="120" w:type="dxa"/>
+            </w:tcMar>
+          </w:tcPr>
+          <w:p>
+            <w:pPr>
+              <w:spacing w:after="40" w:line="264" w:lineRule="auto"/>
+            </w:pPr>
+            <w:r>
+              <w:rPr>
+                <w:sz w:val="17"/>
+              </w:rPr>
+              <w:t>Christentum Verbreitung</w:t>
+            </w:r>
+          </w:p>
+        </w:tc>
+        <w:tc>
+          <w:tcPr>
+            <w:tcW w:type="dxa" w:w="1944"/>
+            <w:tcMar>
+              <w:top w:w="80" w:type="dxa"/>
+              <w:bottom w:w="80" w:type="dxa"/>
+              <w:start w:w="120" w:type="dxa"/>
+              <w:end w:w="120" w:type="dxa"/>
+            </w:tcMar>
+          </w:tcPr>
+          <w:p>
+            <w:pPr>
+              <w:spacing w:after="40" w:line="264" w:lineRule="auto"/>
+            </w:pPr>
+            <w:r>
+              <w:rPr>
+                <w:sz w:val="17"/>
+              </w:rPr>
+              <w:t>falsch</w:t>
+            </w:r>
+          </w:p>
+        </w:tc>
+        <w:tc>
+          <w:tcPr>
+            <w:tcW w:type="dxa" w:w="5184"/>
+            <w:tcMar>
+              <w:top w:w="80" w:type="dxa"/>
+              <w:bottom w:w="80" w:type="dxa"/>
+              <w:start w:w="120" w:type="dxa"/>
+              <w:end w:w="120" w:type="dxa"/>
+            </w:tcMar>
+          </w:tcPr>
+          <w:p>
+            <w:pPr>
+              <w:spacing w:after="40" w:line="264" w:lineRule="auto"/>
+            </w:pPr>
+            <w:r>
+              <w:rPr>
+                <w:sz w:val="17"/>
+              </w:rPr>
+              <w:t>Das Christentum ist weltweit verbreitet, nicht nur in westlichen Ländern.</w:t>
+            </w:r>
+          </w:p>
+        </w:tc>
+      </w:tr>
+      <w:tr>
+        <w:tc>
+          <w:tcPr>
+            <w:tcW w:type="dxa" w:w="2232"/>
+            <w:tcMar>
+              <w:top w:w="80" w:type="dxa"/>
+              <w:bottom w:w="80" w:type="dxa"/>
+              <w:start w:w="120" w:type="dxa"/>
+              <w:end w:w="120" w:type="dxa"/>
+            </w:tcMar>
+          </w:tcPr>
+          <w:p>
+            <w:pPr>
+              <w:spacing w:after="40" w:line="264" w:lineRule="auto"/>
+            </w:pPr>
+            <w:r>
+              <w:rPr>
+                <w:sz w:val="17"/>
+              </w:rPr>
+              <w:t>Koranvortrag</w:t>
+            </w:r>
+          </w:p>
+        </w:tc>
+        <w:tc>
+          <w:tcPr>
+            <w:tcW w:type="dxa" w:w="1944"/>
+            <w:tcMar>
+              <w:top w:w="80" w:type="dxa"/>
+              <w:bottom w:w="80" w:type="dxa"/>
+              <w:start w:w="120" w:type="dxa"/>
+              <w:end w:w="120" w:type="dxa"/>
+            </w:tcMar>
+          </w:tcPr>
+          <w:p>
+            <w:pPr>
+              <w:spacing w:after="40" w:line="264" w:lineRule="auto"/>
+            </w:pPr>
+            <w:r>
+              <w:rPr>
+                <w:sz w:val="17"/>
+              </w:rPr>
+              <w:t>teilweise richtig</w:t>
+            </w:r>
+          </w:p>
+        </w:tc>
+        <w:tc>
+          <w:tcPr>
+            <w:tcW w:type="dxa" w:w="5184"/>
+            <w:tcMar>
+              <w:top w:w="80" w:type="dxa"/>
+              <w:bottom w:w="80" w:type="dxa"/>
+              <w:start w:w="120" w:type="dxa"/>
+              <w:end w:w="120" w:type="dxa"/>
+            </w:tcMar>
+          </w:tcPr>
+          <w:p>
+            <w:pPr>
+              <w:spacing w:after="40" w:line="264" w:lineRule="auto"/>
+            </w:pPr>
+            <w:r>
+              <w:rPr>
+                <w:sz w:val="17"/>
+              </w:rPr>
+              <w:t>Kapitel heissen Suren; der Koran wird rezitiert, nicht einfach gesungen.</w:t>
+            </w:r>
+          </w:p>
+        </w:tc>
+      </w:tr>
+      <w:tr>
+        <w:tc>
+          <w:tcPr>
+            <w:tcW w:type="dxa" w:w="2232"/>
+            <w:tcMar>
+              <w:top w:w="80" w:type="dxa"/>
+              <w:bottom w:w="80" w:type="dxa"/>
+              <w:start w:w="120" w:type="dxa"/>
+              <w:end w:w="120" w:type="dxa"/>
+            </w:tcMar>
+          </w:tcPr>
+          <w:p>
+            <w:pPr>
+              <w:spacing w:after="40" w:line="264" w:lineRule="auto"/>
+            </w:pPr>
+            <w:r>
+              <w:rPr>
+                <w:sz w:val="17"/>
+              </w:rPr>
+              <w:t>Fünf Säulen</w:t>
+            </w:r>
+          </w:p>
+        </w:tc>
+        <w:tc>
+          <w:tcPr>
+            <w:tcW w:type="dxa" w:w="1944"/>
+            <w:tcMar>
+              <w:top w:w="80" w:type="dxa"/>
+              <w:bottom w:w="80" w:type="dxa"/>
+              <w:start w:w="120" w:type="dxa"/>
+              <w:end w:w="120" w:type="dxa"/>
+            </w:tcMar>
+          </w:tcPr>
+          <w:p>
+            <w:pPr>
+              <w:spacing w:after="40" w:line="264" w:lineRule="auto"/>
+            </w:pPr>
+            <w:r>
+              <w:rPr>
+                <w:sz w:val="17"/>
+              </w:rPr>
+              <w:t>unvollständig</w:t>
+            </w:r>
+          </w:p>
+        </w:tc>
+        <w:tc>
+          <w:tcPr>
+            <w:tcW w:type="dxa" w:w="5184"/>
+            <w:tcMar>
+              <w:top w:w="80" w:type="dxa"/>
+              <w:bottom w:w="80" w:type="dxa"/>
+              <w:start w:w="120" w:type="dxa"/>
+              <w:end w:w="120" w:type="dxa"/>
+            </w:tcMar>
+          </w:tcPr>
+          <w:p>
+            <w:pPr>
+              <w:spacing w:after="40" w:line="264" w:lineRule="auto"/>
+            </w:pPr>
+            <w:r>
+              <w:rPr>
+                <w:sz w:val="17"/>
+              </w:rPr>
+              <w:t>Glaubensbekenntnis, Gebet, Zakat, Ramadanfasten und Hadsch; das Gebet fehlte.</w:t>
+            </w:r>
+          </w:p>
+        </w:tc>
+      </w:tr>
+      <w:tr>
+        <w:tc>
+          <w:tcPr>
+            <w:tcW w:type="dxa" w:w="2232"/>
+            <w:tcMar>
+              <w:top w:w="80" w:type="dxa"/>
+              <w:bottom w:w="80" w:type="dxa"/>
+              <w:start w:w="120" w:type="dxa"/>
+              <w:end w:w="120" w:type="dxa"/>
+            </w:tcMar>
+          </w:tcPr>
+          <w:p>
+            <w:pPr>
+              <w:spacing w:after="40" w:line="264" w:lineRule="auto"/>
+            </w:pPr>
+            <w:r>
+              <w:rPr>
+                <w:sz w:val="17"/>
+              </w:rPr>
+              <w:t>Inhalt des Glaubens</w:t>
+            </w:r>
+          </w:p>
+        </w:tc>
+        <w:tc>
+          <w:tcPr>
+            <w:tcW w:type="dxa" w:w="1944"/>
+            <w:tcMar>
+              <w:top w:w="80" w:type="dxa"/>
+              <w:bottom w:w="80" w:type="dxa"/>
+              <w:start w:w="120" w:type="dxa"/>
+              <w:end w:w="120" w:type="dxa"/>
+            </w:tcMar>
+          </w:tcPr>
+          <w:p>
+            <w:pPr>
+              <w:spacing w:after="40" w:line="264" w:lineRule="auto"/>
+            </w:pPr>
+            <w:r>
+              <w:rPr>
+                <w:sz w:val="17"/>
+              </w:rPr>
+              <w:t>falsch</w:t>
+            </w:r>
+          </w:p>
+        </w:tc>
+        <w:tc>
+          <w:tcPr>
+            <w:tcW w:type="dxa" w:w="5184"/>
+            <w:tcMar>
+              <w:top w:w="80" w:type="dxa"/>
+              <w:bottom w:w="80" w:type="dxa"/>
+              <w:start w:w="120" w:type="dxa"/>
+              <w:end w:w="120" w:type="dxa"/>
+            </w:tcMar>
+          </w:tcPr>
+          <w:p>
+            <w:pPr>
+              <w:spacing w:after="40" w:line="264" w:lineRule="auto"/>
+            </w:pPr>
+            <w:r>
+              <w:rPr>
+                <w:sz w:val="17"/>
+              </w:rPr>
+              <w:t>Vorstellungen, Werte, Verhalten, Regeln, Bräuche, Feste, Gebet und Gemeinschaft.</w:t>
+            </w:r>
+          </w:p>
+        </w:tc>
+      </w:tr>
+      <w:tr>
+        <w:tc>
+          <w:tcPr>
+            <w:tcW w:type="dxa" w:w="2232"/>
+            <w:tcMar>
+              <w:top w:w="80" w:type="dxa"/>
+              <w:bottom w:w="80" w:type="dxa"/>
+              <w:start w:w="120" w:type="dxa"/>
+              <w:end w:w="120" w:type="dxa"/>
+            </w:tcMar>
+          </w:tcPr>
+          <w:p>
+            <w:pPr>
+              <w:spacing w:after="40" w:line="264" w:lineRule="auto"/>
+            </w:pPr>
+            <w:r>
+              <w:rPr>
+                <w:sz w:val="17"/>
+              </w:rPr>
+              <w:t>100er-Grafik</w:t>
+            </w:r>
+          </w:p>
+        </w:tc>
+        <w:tc>
+          <w:tcPr>
+            <w:tcW w:type="dxa" w:w="1944"/>
+            <w:tcMar>
+              <w:top w:w="80" w:type="dxa"/>
+              <w:bottom w:w="80" w:type="dxa"/>
+              <w:start w:w="120" w:type="dxa"/>
+              <w:end w:w="120" w:type="dxa"/>
+            </w:tcMar>
+          </w:tcPr>
+          <w:p>
+            <w:pPr>
+              <w:spacing w:after="40" w:line="264" w:lineRule="auto"/>
+            </w:pPr>
+            <w:r>
+              <w:rPr>
+                <w:sz w:val="17"/>
+              </w:rPr>
+              <w:t>drei Zahlen falsch</w:t>
+            </w:r>
+          </w:p>
+        </w:tc>
+        <w:tc>
+          <w:tcPr>
+            <w:tcW w:type="dxa" w:w="5184"/>
+            <w:tcMar>
+              <w:top w:w="80" w:type="dxa"/>
+              <w:bottom w:w="80" w:type="dxa"/>
+              <w:start w:w="120" w:type="dxa"/>
+              <w:end w:w="120" w:type="dxa"/>
+            </w:tcMar>
+          </w:tcPr>
+          <w:p>
+            <w:pPr>
+              <w:spacing w:after="40" w:line="264" w:lineRule="auto"/>
+            </w:pPr>
+            <w:r>
+              <w:rPr>
+                <w:sz w:val="17"/>
+              </w:rPr>
+              <w:t>31 Christen, 23 Muslime, 15 Hindus, 1 Jude, 7 Buddhisten, 23 andere/keine.</w:t>
+            </w:r>
+          </w:p>
+        </w:tc>
+      </w:tr>
+      <w:tr>
+        <w:tc>
+          <w:tcPr>
+            <w:tcW w:type="dxa" w:w="2232"/>
+            <w:tcMar>
+              <w:top w:w="80" w:type="dxa"/>
+              <w:bottom w:w="80" w:type="dxa"/>
+              <w:start w:w="120" w:type="dxa"/>
+              <w:end w:w="120" w:type="dxa"/>
+            </w:tcMar>
+          </w:tcPr>
+          <w:p>
+            <w:pPr>
+              <w:spacing w:after="40" w:line="264" w:lineRule="auto"/>
+            </w:pPr>
+            <w:r>
+              <w:rPr>
+                <w:sz w:val="17"/>
+              </w:rPr>
+              <w:t>Symbol des Judentums</w:t>
+            </w:r>
+          </w:p>
+        </w:tc>
+        <w:tc>
+          <w:tcPr>
+            <w:tcW w:type="dxa" w:w="1944"/>
+            <w:tcMar>
+              <w:top w:w="80" w:type="dxa"/>
+              <w:bottom w:w="80" w:type="dxa"/>
+              <w:start w:w="120" w:type="dxa"/>
+              <w:end w:w="120" w:type="dxa"/>
+            </w:tcMar>
+          </w:tcPr>
+          <w:p>
+            <w:pPr>
+              <w:spacing w:after="40" w:line="264" w:lineRule="auto"/>
+            </w:pPr>
+            <w:r>
+              <w:rPr>
+                <w:sz w:val="17"/>
+              </w:rPr>
+              <w:t>vertretbar, aber nicht die Zielantwort</w:t>
+            </w:r>
+          </w:p>
+        </w:tc>
+        <w:tc>
+          <w:tcPr>
+            <w:tcW w:type="dxa" w:w="5184"/>
+            <w:tcMar>
+              <w:top w:w="80" w:type="dxa"/>
+              <w:bottom w:w="80" w:type="dxa"/>
+              <w:start w:w="120" w:type="dxa"/>
+              <w:end w:w="120" w:type="dxa"/>
+            </w:tcMar>
+          </w:tcPr>
+          <w:p>
+            <w:pPr>
+              <w:spacing w:after="40" w:line="264" w:lineRule="auto"/>
+            </w:pPr>
+            <w:r>
+              <w:rPr>
+                <w:sz w:val="17"/>
+              </w:rPr>
+              <w:t>Die Menora ist jüdisch; für die Zuordnung im Lernpaket wird der Davidstern verlangt.</w:t>
+            </w:r>
+          </w:p>
+        </w:tc>
+      </w:tr>
+      <w:tr>
+        <w:tc>
+          <w:tcPr>
+            <w:tcW w:type="dxa" w:w="2232"/>
+            <w:tcMar>
+              <w:top w:w="80" w:type="dxa"/>
+              <w:bottom w:w="80" w:type="dxa"/>
+              <w:start w:w="120" w:type="dxa"/>
+              <w:end w:w="120" w:type="dxa"/>
+            </w:tcMar>
+          </w:tcPr>
+          <w:p>
+            <w:pPr>
+              <w:spacing w:after="40" w:line="264" w:lineRule="auto"/>
+            </w:pPr>
+            <w:r>
+              <w:rPr>
+                <w:sz w:val="17"/>
+              </w:rPr>
+              <w:t>Schabbat</w:t>
+            </w:r>
+          </w:p>
+        </w:tc>
+        <w:tc>
+          <w:tcPr>
+            <w:tcW w:type="dxa" w:w="1944"/>
+            <w:tcMar>
+              <w:top w:w="80" w:type="dxa"/>
+              <w:bottom w:w="80" w:type="dxa"/>
+              <w:start w:w="120" w:type="dxa"/>
+              <w:end w:w="120" w:type="dxa"/>
+            </w:tcMar>
+          </w:tcPr>
+          <w:p>
+            <w:pPr>
+              <w:spacing w:after="40" w:line="264" w:lineRule="auto"/>
+            </w:pPr>
+            <w:r>
+              <w:rPr>
+                <w:sz w:val="17"/>
+              </w:rPr>
+              <w:t>inhaltlich richtig</w:t>
+            </w:r>
+          </w:p>
+        </w:tc>
+        <w:tc>
+          <w:tcPr>
+            <w:tcW w:type="dxa" w:w="5184"/>
+            <w:tcMar>
+              <w:top w:w="80" w:type="dxa"/>
+              <w:bottom w:w="80" w:type="dxa"/>
+              <w:start w:w="120" w:type="dxa"/>
+              <w:end w:w="120" w:type="dxa"/>
+            </w:tcMar>
+          </w:tcPr>
+          <w:p>
+            <w:pPr>
+              <w:spacing w:after="40" w:line="264" w:lineRule="auto"/>
+            </w:pPr>
+            <w:r>
+              <w:rPr>
+                <w:sz w:val="17"/>
+              </w:rPr>
+              <w:t>Schreibweise: Schabbat oder Sabbat.</w:t>
+            </w:r>
+          </w:p>
+        </w:tc>
+      </w:tr>
+    </w:tbl>
+    <w:p>
+      <w:pPr>
+        <w:spacing w:after="20"/>
+      </w:pPr>
+      <w:r>
+        <w:rPr>
+          <w:b w:val="0"/>
+          <w:i w:val="0"/>
+        </w:rPr>
+      </w:r>
+    </w:p>
+    <w:p>
+      <w:r>
+        <w:rPr>
+          <w:b w:val="0"/>
+          <w:i/>
+          <w:color w:val="596A70"/>
+          <w:sz w:val="18"/>
+        </w:rPr>
+        <w:t>Nicht beantwortete Zeilen wurden nicht als Antworten von David bewertet.</w:t>
+      </w:r>
+    </w:p>
+    <w:p>
+      <w:r>
+        <w:br w:type="page"/>
+      </w:r>
+    </w:p>
+    <w:p>
+      <w:pPr>
+        <w:pStyle w:val="Heading1"/>
+      </w:pPr>
+      <w:r>
+        <w:t>13. Schnellkontrolle für Eltern</w:t>
       </w:r>
     </w:p>
     <w:p>

</xml_diff>